<commit_message>
Update daily snapshot and digest outputs
</commit_message>
<xml_diff>
--- a/Space_News_01_10_2026.docx
+++ b/Space_News_01_10_2026.docx
@@ -155,7 +155,7 @@
           <w:b/>
           <w:sz w:val="26"/>
         </w:rPr>
-        <w:t>1. UP's Project GANGA gets 3,000 DSP applications since its launch in June</w:t>
+        <w:t>1. Kalam Foundation Takes Ramanathapuram School Kids To ISRO - Deccan Chronicle</w:t>
       </w:r>
     </w:p>
     <w:p>
@@ -164,184 +164,6 @@
         <w:jc w:val="left"/>
       </w:pPr>
       <w:hyperlink r:id="rId12">
-        <w:r>
-          <w:rPr>
-            <w:color w:val="0000FF"/>
-            <w:u w:val="single"/>
-          </w:rPr>
-          <w:t>Read more</w:t>
-        </w:r>
-      </w:hyperlink>
-    </w:p>
-    <w:p>
-      <w:pPr>
-        <w:spacing w:after="120"/>
-        <w:jc w:val="center"/>
-      </w:pPr>
-      <w:r>
-        <w:drawing>
-          <wp:inline xmlns:a="http://schemas.openxmlformats.org/drawingml/2006/main" xmlns:pic="http://schemas.openxmlformats.org/drawingml/2006/picture">
-            <wp:extent cx="4389120" cy="2370125"/>
-            <wp:docPr id="3" name="Picture 3"/>
-            <wp:cNvGraphicFramePr>
-              <a:graphicFrameLocks noChangeAspect="1"/>
-            </wp:cNvGraphicFramePr>
-            <a:graphic>
-              <a:graphicData uri="http://schemas.openxmlformats.org/drawingml/2006/picture">
-                <pic:pic>
-                  <pic:nvPicPr>
-                    <pic:cNvPr id="0" name="image.png"/>
-                    <pic:cNvPicPr/>
-                  </pic:nvPicPr>
-                  <pic:blipFill>
-                    <a:blip r:embed="rId13"/>
-                    <a:stretch>
-                      <a:fillRect/>
-                    </a:stretch>
-                  </pic:blipFill>
-                  <pic:spPr>
-                    <a:xfrm>
-                      <a:off x="0" y="0"/>
-                      <a:ext cx="4389120" cy="2370125"/>
-                    </a:xfrm>
-                    <a:prstGeom prst="rect"/>
-                  </pic:spPr>
-                </pic:pic>
-              </a:graphicData>
-            </a:graphic>
-          </wp:inline>
-        </w:drawing>
-      </w:r>
-    </w:p>
-    <w:p>
-      <w:pPr>
-        <w:spacing w:after="120" w:line="276" w:lineRule="auto"/>
-        <w:jc w:val="both"/>
-      </w:pPr>
-      <w:r>
-        <w:rPr>
-          <w:rFonts w:ascii="Times New Roman" w:hAnsi="Times New Roman"/>
-          <w:sz w:val="24"/>
-        </w:rPr>
-        <w:t>- Digital India - 2 min read Project GANGA (Government Assisted Network for Growth and Advancement) is being implemented under the aegis of the UP State Transformation Commission, in association with OneOTT Intertainment Ltd (OIL), the broadband arm of Hinduja Global Solutions. Arpit Gupta - ETGovernment - Published On Sep 30, 2026 at 05:56 PM IST Select ETGovernment as Preferred Choice on Google Copy Link Share on WhatsApp Share on Linkedin Share on X Share on Telegram Share on Facebook The broadband services being rolled out under the initiative will be offered under the GangaFiber brand, with the tagline "Connecting Every Home, Enabling Every Possibility". Uttar Pradesh's Project GANGA, the state government's digital connectivity initiative being implemented in association with OneOTT Intertainment Ltd (OIL), the broadband arm of Hinduja Global Solutions, has received more than 3,000 applications from aspiring Digital Service Providers (DSPs) since its launch in June. More than 600 shortlisted candidates have completed training conducted by OIL, with the first DSP-led networks now being rolled out with financial support under the state government's CM-YUVA scheme . Collectively, these DSPs have the potential to connect up to 150,000 homes across Uttar Pradesh, according to the programme. Advt The broadband services being rolled out under the initiative will be offered under the GangaFiber brand, with the tagline "Connecting Every Home, Enabling Every Possibility". GangaFiber plans start at ₹399 per month, inclusive of taxes, for a 50 Mbps connection, according to the company. The portfolio goes up to a 1 Gbps plan priced at ₹1,179 per month. Select plans also include access to more than 100 television channels and 13 OTT platforms. Project GANGA (Government Assisted Network for Growth and Advancement) is being implemented under the aegis of the Uttar Pradesh State Transformation Commission (STC), in association with OIL. "Our Chief Minister's vision is clear; like expressways, Uttar Pradesh should be the number one state in building digital highways ," said Manoj Kumar Singh, CEO, State Transformation Commission, Government of Uttar Pradesh. "Digital is a necessity for every citizen, enabling services from education and healthcare to remote working opportunities. Project GANGA was conceived to turn that vision into action at the grassroots," Singh said. Local entrepreneurs as last-mile operators The initiative is also positioning local entrepreneurs as the last-mile operators of the broadband network. According to the programme, the CM-YUVA scheme is supporting young entrepreneurs, including women, in setting up DSP businesses in their communities. Vynsley Fernandes, whole-time director, HGS, and MD &amp; CEO of OIL, said the company had trained more than 600 potential DSPs in broadband business operations, technology, marketing and customer service. "Each DSP we train becomes the digital backbone of their own community," Fernandes said, adding that the response from across Uttar Pradesh indicated demand for the model. The rollout follows the opening of a dedicated DSP Training Centre in Lucknow last month. The centre was inaugurated by Harisoa Lalatiana Accouche, High Commissioner of Seychelles to India, along with Manoj Kumar Singh, in the presence of senior state government and Hinduja Group officials. Project GANGA has also launched an online Learning Management System, or Learning Hub, aimed at making DSP training accessible to candidates across the state, including those in remote locations. The platform provides structured modules covering technical and business skills and is designed to help aspiring DSPs become network-ready without having to travel to a physical training centre. The state government and OIL plan to expand the DSP network as the programme scales, with the broader objective of extending high-speed broadband connectivity to households and businesses across Uttar Pradesh. Arpit Gupta , --&gt; - By - See more on: - Uttar Pradesh Project GANGA , - Digital Service Providers (DSP) , - broadband connectivity , - GangaFiber , - CM-YUVA scheme , - OneOTT Intertainment Ltd , - digital highways , - high-speed internet , - local entrepreneurs broadband , - DSP Training Centre Lucknow Telegram Facebook Comments What are your thoughts? Comment Now --&gt; Comment Now Read Comment (1) All Comments By commenting, you agree to the Prohibited Content Policy Post Find this Comment Offensive? Choose your reason below and click on the submit button. This will alert our moderators to take actions REASONS FOR REPORTING Foul Language Defamatory Inciting hatred against a certain community Out of Context / Spam Others Report Join the community of 2M+ industry professionals. Subscribe to Newsletter to get latest insights &amp; analysis in your inbox. All about ETGovernment industry right on your smartphone! - Download the ETGovernment App and get the Realtime updates and Save your favourite articles. Scan to download App --&gt; - Home - News - UP's Project GANGA gets 3,000 DSP applications since its launch in June</w:t>
-      </w:r>
-    </w:p>
-    <w:p>
-      <w:pPr>
-        <w:pBdr>
-          <w:bottom w:val="single" w:sz="6" w:space="6" w:color="A6A6A6"/>
-        </w:pBdr>
-      </w:pPr>
-    </w:p>
-    <w:p/>
-    <w:p>
-      <w:pPr>
-        <w:spacing w:after="60"/>
-      </w:pPr>
-      <w:r>
-        <w:rPr>
-          <w:rFonts w:ascii="Times New Roman" w:hAnsi="Times New Roman"/>
-          <w:b/>
-          <w:sz w:val="26"/>
-        </w:rPr>
-        <w:t>2. Apple Pay launches in India with Axis Bank partnership</w:t>
-      </w:r>
-    </w:p>
-    <w:p>
-      <w:pPr>
-        <w:spacing w:after="80"/>
-        <w:jc w:val="left"/>
-      </w:pPr>
-      <w:hyperlink r:id="rId14">
-        <w:r>
-          <w:rPr>
-            <w:color w:val="0000FF"/>
-            <w:u w:val="single"/>
-          </w:rPr>
-          <w:t>Read more</w:t>
-        </w:r>
-      </w:hyperlink>
-    </w:p>
-    <w:p>
-      <w:pPr>
-        <w:spacing w:after="120"/>
-        <w:jc w:val="center"/>
-      </w:pPr>
-      <w:r>
-        <w:drawing>
-          <wp:inline xmlns:a="http://schemas.openxmlformats.org/drawingml/2006/main" xmlns:pic="http://schemas.openxmlformats.org/drawingml/2006/picture">
-            <wp:extent cx="4389120" cy="2468880"/>
-            <wp:docPr id="4" name="Picture 4"/>
-            <wp:cNvGraphicFramePr>
-              <a:graphicFrameLocks noChangeAspect="1"/>
-            </wp:cNvGraphicFramePr>
-            <a:graphic>
-              <a:graphicData uri="http://schemas.openxmlformats.org/drawingml/2006/picture">
-                <pic:pic>
-                  <pic:nvPicPr>
-                    <pic:cNvPr id="0" name="image.png"/>
-                    <pic:cNvPicPr/>
-                  </pic:nvPicPr>
-                  <pic:blipFill>
-                    <a:blip r:embed="rId15"/>
-                    <a:stretch>
-                      <a:fillRect/>
-                    </a:stretch>
-                  </pic:blipFill>
-                  <pic:spPr>
-                    <a:xfrm>
-                      <a:off x="0" y="0"/>
-                      <a:ext cx="4389120" cy="2468880"/>
-                    </a:xfrm>
-                    <a:prstGeom prst="rect"/>
-                  </pic:spPr>
-                </pic:pic>
-              </a:graphicData>
-            </a:graphic>
-          </wp:inline>
-        </w:drawing>
-      </w:r>
-    </w:p>
-    <w:p>
-      <w:pPr>
-        <w:spacing w:after="120" w:line="276" w:lineRule="auto"/>
-        <w:jc w:val="both"/>
-      </w:pPr>
-      <w:r>
-        <w:rPr>
-          <w:rFonts w:ascii="Times New Roman" w:hAnsi="Times New Roman"/>
-          <w:sz w:val="24"/>
-        </w:rPr>
-        <w:t>- Digital India - 1 min read Customers can use Apple Pay with Axis Bank's credit cards initially on the Visa and Mastercard networks. The service is expected to enhance the digital payment landscape in a rapidly evolving market. - Reuters - Published On Sep 30, 2026 at 05:32 PM IST Select ETGovernment as Preferred Choice on Google Copy Link Share on WhatsApp Share on Linkedin Share on X Share on Telegram Share on Facebook Apple Pay launches in India Apple Pay has launched in India through a partnership with Axis Bank, giving the payment service its first foothold in one of the world's largest digital payments markets, the lender said on Wednesday. Axis Bank, India's third-largest private lender, will be the first Indian bank to offer Apple Pay, initially to customers with credit cards on the Visa and Mastercard networks. Cards on India's homegrown RuPay network will not be eligible. "India is home to a dynamic and digitally savvy population that continues to embrace a cashless future while expecting the highest standards of security and privacy, and we're so excited to bring Apple Pay to users in India today," Jennifer Bailey, Apple's vice president of Apple Pay and Apple Wallet, said in a statement. Advt Axis Bank is India's fourth-largest credit card issuer, with 16.3 million cards outstanding as of August, out of 124 million nationwide, central bank data showed. The launch would help the US company offer its payment service in the world's most populous country, one of the few major economies where it is not available. Apple Pay has also held talks with larger rivals HDFC Bank and ICICI Bank, but has yet to agree commercial terms, Reuters reported earlier this month. India's Unified Payments Interface , a real-time bank transfer system, accounts for 84% of digital payment volumes and is the world's largest retail fast-payment system by transaction volume, according to a 2025 IMF report. Customers can add eligible cards through Axis Bank's mobile app or Apple Wallet and make payments in stores, in apps and online using an iPhone, Apple Watch or iPad, the lender said in a statement. Apple Pay lets users make contact less payments without entering a card PIN or one-time password, authenticating transactions through Face ID, Touch ID or a device passcode. - See more on: - Apple Pay India , - Axis Bank partnership , - digital payments , - contactless payments , - Unified Payments Interface Telegram Facebook Comments What are your thoughts? Comment Now --&gt; Comment Now Read Comment (1) All Comments By commenting, you agree to the Prohibited Content Policy Post Find this Comment Offensive? Choose your reason below and click on the submit button. This will alert our moderators to take actions REASONS FOR REPORTING Foul Language Defamatory Inciting hatred against a certain community Out of Context / Spam Others Report Join the community of 2M+ industry professionals. Subscribe to Newsletter to get latest insights &amp; analysis in your inbox. --&gt; All about ETGovernment industry right on your smartphone! - Download the ETGovernment App and get the Realtime updates and Save your favourite articles. Scan to download App --&gt; - Home - News - Apple Pay launches in India with Axis Bank partnership</w:t>
-      </w:r>
-    </w:p>
-    <w:p>
-      <w:pPr>
-        <w:pBdr>
-          <w:bottom w:val="single" w:sz="6" w:space="6" w:color="A6A6A6"/>
-        </w:pBdr>
-      </w:pPr>
-    </w:p>
-    <w:p/>
-    <w:p>
-      <w:pPr>
-        <w:spacing w:after="60"/>
-      </w:pPr>
-      <w:r>
-        <w:rPr>
-          <w:rFonts w:ascii="Times New Roman" w:hAnsi="Times New Roman"/>
-          <w:b/>
-          <w:sz w:val="26"/>
-        </w:rPr>
-        <w:t>3. Kalam Foundation Takes Ramanathapuram School Kids To ISRO - Deccan Chronicle</w:t>
-      </w:r>
-    </w:p>
-    <w:p>
-      <w:pPr>
-        <w:spacing w:after="80"/>
-        <w:jc w:val="left"/>
-      </w:pPr>
-      <w:hyperlink r:id="rId16">
         <w:r>
           <w:rPr>
             <w:color w:val="0000FF"/>
@@ -382,7 +204,7 @@
           <w:b/>
           <w:sz w:val="26"/>
         </w:rPr>
-        <w:t>4. ISRO scientist used to wake up at 5 am to memorise Vedas: Meet Kerala's Govind Krishnan, who left regular - economictimes.com</w:t>
+        <w:t>2. ISRO scientist used to wake up at 5 am to memorise Vedas: Meet Kerala's Govind Krishnan, who left regular - economictimes.com</w:t>
       </w:r>
     </w:p>
     <w:p>
@@ -390,7 +212,7 @@
         <w:spacing w:after="80"/>
         <w:jc w:val="left"/>
       </w:pPr>
-      <w:hyperlink r:id="rId17">
+      <w:hyperlink r:id="rId13">
         <w:r>
           <w:rPr>
             <w:color w:val="0000FF"/>
@@ -431,7 +253,7 @@
           <w:b/>
           <w:sz w:val="26"/>
         </w:rPr>
-        <w:t>5. ISRO launches Santulan nutrition program for Gaganyaan crew | Tap to know more | Inshorts - Inshorts</w:t>
+        <w:t>3. ISRO launches Santulan nutrition program for Gaganyaan crew | Tap to know more | Inshorts - Inshorts</w:t>
       </w:r>
     </w:p>
     <w:p>
@@ -439,7 +261,7 @@
         <w:spacing w:after="80"/>
         <w:jc w:val="left"/>
       </w:pPr>
-      <w:hyperlink r:id="rId18">
+      <w:hyperlink r:id="rId14">
         <w:r>
           <w:rPr>
             <w:color w:val="0000FF"/>
@@ -480,7 +302,7 @@
           <w:b/>
           <w:sz w:val="26"/>
         </w:rPr>
-        <w:t>6. Isro looking for nutritionists for Gaganyaan astronauts. Here's what they will do - India Today</w:t>
+        <w:t>4. Isro looking for nutritionists for Gaganyaan astronauts. Here's what they will do - India Today</w:t>
       </w:r>
     </w:p>
     <w:p>
@@ -488,7 +310,7 @@
         <w:spacing w:after="80"/>
         <w:jc w:val="left"/>
       </w:pPr>
-      <w:hyperlink r:id="rId19">
+      <w:hyperlink r:id="rId15">
         <w:r>
           <w:rPr>
             <w:color w:val="0000FF"/>
@@ -529,7 +351,7 @@
           <w:b/>
           <w:sz w:val="26"/>
         </w:rPr>
-        <w:t>7. 90-plus-day spaceflights linked to higher rates of hip fractures in astronauts</w:t>
+        <w:t>5. 90-plus-day spaceflights linked to higher rates of hip fractures in astronauts</w:t>
       </w:r>
     </w:p>
     <w:p>
@@ -537,7 +359,7 @@
         <w:spacing w:after="80"/>
         <w:jc w:val="left"/>
       </w:pPr>
-      <w:hyperlink r:id="rId20">
+      <w:hyperlink r:id="rId16">
         <w:r>
           <w:rPr>
             <w:color w:val="0000FF"/>
@@ -556,7 +378,7 @@
         <w:drawing>
           <wp:inline xmlns:a="http://schemas.openxmlformats.org/drawingml/2006/main" xmlns:pic="http://schemas.openxmlformats.org/drawingml/2006/picture">
             <wp:extent cx="4389120" cy="4389120"/>
-            <wp:docPr id="5" name="Picture 5"/>
+            <wp:docPr id="3" name="Picture 3"/>
             <wp:cNvGraphicFramePr>
               <a:graphicFrameLocks noChangeAspect="1"/>
             </wp:cNvGraphicFramePr>
@@ -568,7 +390,7 @@
                     <pic:cNvPicPr/>
                   </pic:nvPicPr>
                   <pic:blipFill>
-                    <a:blip r:embed="rId21"/>
+                    <a:blip r:embed="rId17"/>
                     <a:stretch>
                       <a:fillRect/>
                     </a:stretch>
@@ -618,7 +440,7 @@
           <w:b/>
           <w:sz w:val="26"/>
         </w:rPr>
-        <w:t>8. Humanoid robot fleet decommissioned in wild Terminator-style leap into molten steel</w:t>
+        <w:t>6. Humanoid robot fleet decommissioned in wild Terminator-style leap into molten steel</w:t>
       </w:r>
     </w:p>
     <w:p>
@@ -626,7 +448,7 @@
         <w:spacing w:after="80"/>
         <w:jc w:val="left"/>
       </w:pPr>
-      <w:hyperlink r:id="rId22">
+      <w:hyperlink r:id="rId18">
         <w:r>
           <w:rPr>
             <w:color w:val="0000FF"/>

</xml_diff>